<commit_message>
Renato Russo: revisão da Parte 3 (show de Santos, antítese, detalhes sem fonte)
Co-Authored-By: Claude Opus 5.5 <noreply@anthropic.com>
Claude-Session: https://claude.ai/code/session_01MJjUEEZrxQDEUifKK2vj9g
</commit_message>
<xml_diff>
--- a/roteiros/renato-russo/Renato_Parte3.docx
+++ b/roteiros/renato-russo/Renato_Parte3.docx
@@ -135,7 +135,7 @@
         <w:rPr>
           <w:color w:val="000000"/>
         </w:rPr>
-        <w:t>Renato Russo nunca escondeu do público que gostava de homens. Ele falava disso em entrevistas, numa época em que quase nenhum artista grande do país tinha coragem de falar.</w:t>
+        <w:t>Renato Russo falava abertamente, em entrevistas, que gostava de homens. Fazia isso numa época em que quase nenhum artista grande do país tinha essa coragem.</w:t>
       </w:r>
     </w:p>
     <w:p>
@@ -143,7 +143,7 @@
         <w:rPr>
           <w:color w:val="000000"/>
         </w:rPr>
-        <w:t>O que ele escondia era outra coisa.</w:t>
+        <w:t>A doença ficava trancada em outro lugar.</w:t>
       </w:r>
     </w:p>
     <w:p>
@@ -159,7 +159,7 @@
         <w:rPr>
           <w:color w:val="000000"/>
         </w:rPr>
-        <w:t>Renato tinha visto isso acontecer de perto, com um colega da mesma geração do rock brasileiro.</w:t>
+        <w:t>Renato tinha visto isso acontecer com um colega da mesma geração do rock brasileiro.</w:t>
       </w:r>
     </w:p>
     <w:p>
@@ -287,7 +287,7 @@
         <w:rPr>
           <w:color w:val="000000"/>
         </w:rPr>
-        <w:t>No ano seguinte, ele fez uma coisa que nenhum astro de rock brasileiro tinha feito. Gravou um disco solo inteiro em inglês, The Stonewall Celebration Concert. A ideia começou como um show beneficente, só voz e piano, com o tecladista Carlos Trilha. Renato gostou tanto do resultado que levou o projeto para o estúdio.</w:t>
+        <w:t>No ano seguinte, ele fez uma coisa rara para um astro do rock brasileiro. Gravou um disco solo inteiro em inglês, The Stonewall Celebration Concert. A ideia começou como um show beneficente, só voz e piano, com o tecladista Carlos Trilha. Renato gostou tanto do resultado que levou o projeto para o estúdio.</w:t>
       </w:r>
     </w:p>
     <w:p>
@@ -327,7 +327,7 @@
         <w:rPr>
           <w:color w:val="000000"/>
         </w:rPr>
-        <w:t>Em janeiro de mil novecentos e noventa e cinco, a Legião Urbana fez um show em Santos, no litoral de São Paulo. Era a turnê do disco O Descobrimento do Brasil.</w:t>
+        <w:t>Catorze de janeiro de mil novecentos e noventa e cinco. A Legião Urbana tocava numa casa noturna de Santos, no litoral de São Paulo, para cerca de mil pessoas. Era a turnê do disco O Descobrimento do Brasil.</w:t>
       </w:r>
     </w:p>
     <w:p>
@@ -335,7 +335,7 @@
         <w:rPr>
           <w:color w:val="000000"/>
         </w:rPr>
-        <w:t>No meio da apresentação, alguém da plateia acertou Renato com uma lata de cerveja. Ele reagiu com raiva, xingou o responsável e o show terminou ali.</w:t>
+        <w:t>No meio da música O Teatro dos Vampiros, uma lata de cerveja voou da plateia e acertou Renato.</w:t>
       </w:r>
     </w:p>
     <w:p>
@@ -343,7 +343,7 @@
         <w:rPr>
           <w:color w:val="000000"/>
         </w:rPr>
-        <w:t>Ninguém sabia na hora.</w:t>
+        <w:t>Ele parou tudo. Mandou acender as luzes e avisou que não ia continuar.</w:t>
       </w:r>
     </w:p>
     <w:p>
@@ -351,7 +351,7 @@
         <w:rPr>
           <w:color w:val="000000"/>
         </w:rPr>
-        <w:t>Mas aquela noite em Santos foi a última vez que a Legião Urbana subiu num palco.</w:t>
+        <w:t>Minutos depois, voltou. Cantou Faroeste Caboclo, inteira. E fechou a noite com Índios.</w:t>
       </w:r>
     </w:p>
     <w:p>
@@ -359,7 +359,15 @@
         <w:rPr>
           <w:color w:val="000000"/>
         </w:rPr>
-        <w:t>Renato nunca mais fez um show. Nas poucas fotos dos meses seguintes, o rosto dele aparecia cada vez mais fino.</w:t>
+        <w:t>Ninguém sabia na hora. Mas aquela noite em Santos foi a última vez que a Legião Urbana subiu num palco.</w:t>
+      </w:r>
+    </w:p>
+    <w:p>
+      <w:r>
+        <w:rPr>
+          <w:color w:val="000000"/>
+        </w:rPr>
+        <w:t>Logo depois, a turnê foi cancelada. Renato nunca mais fez um show. Nas poucas fotos dos meses seguintes, o rosto dele aparecia cada vez mais fino.</w:t>
       </w:r>
     </w:p>
     <w:p>
@@ -383,7 +391,7 @@
         <w:rPr>
           <w:color w:val="C00000"/>
         </w:rPr>
-        <w:t>A partir daí, Renato Russo praticamente desapareceu da vida pública. Os fãs achavam que era uma pausa. A família achava que era cansaço. A verdade estava guardada naquele papel de mil novecentos e noventa. E é hora de você saber o que estava escrito nele.</w:t>
+        <w:t>A partir daí, Renato Russo praticamente desapareceu da vida pública. Os fãs achavam que era só uma pausa. A verdade estava guardada naquele papel de mil novecentos e noventa. E é hora de você saber o que estava escrito nele.</w:t>
       </w:r>
     </w:p>
     <w:p>
@@ -599,7 +607,7 @@
         <w:rPr>
           <w:color w:val="000000"/>
         </w:rPr>
-        <w:t>A notícia correu o país antes de o dia clarear. As rádios interromperam a programação. Fãs começaram a se reunir na porta do prédio, em Ipanema.</w:t>
+        <w:t>Na manhã daquela sexta-feira, a notícia tomou conta do país. Fãs começaram a se reunir na porta do prédio, em Ipanema.</w:t>
       </w:r>
     </w:p>
     <w:p>
@@ -623,7 +631,7 @@
         <w:rPr>
           <w:color w:val="1F4EB4"/>
         </w:rPr>
-        <w:t>A mulher que ensinou inglês para o filho, que cuidou dele na cama aos quinze anos, descobriu o segredo dele junto com o resto do Brasil. Pela TV.</w:t>
+        <w:t>A mulher que viu o filho preso naquela cama aos quinze anos descobriu o segredo dele junto com o resto do Brasil. Pela TV.</w:t>
       </w:r>
     </w:p>
     <w:p>

</xml_diff>